<commit_message>
Add dashboard building guide/documentation
</commit_message>
<xml_diff>
--- a/Building dashboard.docx
+++ b/Building dashboard.docx
@@ -3,37 +3,92 @@
 <w:document xmlns:wpc="http://schemas.microsoft.com/office/word/2010/wordprocessingCanvas" xmlns:cx="http://schemas.microsoft.com/office/drawing/2014/chartex" xmlns:cx1="http://schemas.microsoft.com/office/drawing/2015/9/8/chartex" xmlns:cx2="http://schemas.microsoft.com/office/drawing/2015/10/21/chartex" xmlns:cx3="http://schemas.microsoft.com/office/drawing/2016/5/9/chartex" xmlns:cx4="http://schemas.microsoft.com/office/drawing/2016/5/10/chartex" xmlns:cx5="http://schemas.microsoft.com/office/drawing/2016/5/11/chartex" xmlns:cx6="http://schemas.microsoft.com/office/drawing/2016/5/12/chartex" xmlns:cx7="http://schemas.microsoft.com/office/drawing/2016/5/13/chartex" xmlns:cx8="http://schemas.microsoft.com/office/drawing/2016/5/14/chartex" xmlns:mc="http://schemas.openxmlformats.org/markup-compatibility/2006" xmlns:aink="http://schemas.microsoft.com/office/drawing/2016/ink" xmlns:am3d="http://schemas.microsoft.com/office/drawing/2017/model3d" xmlns:o="urn:schemas-microsoft-com:office:office" xmlns:oel="http://schemas.microsoft.com/office/2019/extlst" xmlns:r="http://schemas.openxmlformats.org/officeDocument/2006/relationships" xmlns:m="http://schemas.openxmlformats.org/officeDocument/2006/math" xmlns:v="urn:schemas-microsoft-com:vml" xmlns:wp14="http://schemas.microsoft.com/office/word/2010/wordprocessingDrawing" xmlns:wp="http://schemas.openxmlformats.org/drawingml/2006/wordprocessingDrawing" xmlns:w10="urn:schemas-microsoft-com:office:word" xmlns:w="http://schemas.openxmlformats.org/wordprocessingml/2006/main" xmlns:w14="http://schemas.microsoft.com/office/word/2010/wordml" xmlns:w15="http://schemas.microsoft.com/office/word/2012/wordml" xmlns:w16cex="http://schemas.microsoft.com/office/word/2018/wordml/cex" xmlns:w16cid="http://schemas.microsoft.com/office/word/2016/wordml/cid" xmlns:w16="http://schemas.microsoft.com/office/word/2018/wordml" xmlns:w16du="http://schemas.microsoft.com/office/word/2023/wordml/word16du" xmlns:w16sdtdh="http://schemas.microsoft.com/office/word/2020/wordml/sdtdatahash" xmlns:w16sdtfl="http://schemas.microsoft.com/office/word/2024/wordml/sdtformatlock" xmlns:w16se="http://schemas.microsoft.com/office/word/2015/wordml/symex" xmlns:wpg="http://schemas.microsoft.com/office/word/2010/wordprocessingGroup" xmlns:wpi="http://schemas.microsoft.com/office/word/2010/wordprocessingInk" xmlns:wne="http://schemas.microsoft.com/office/word/2006/wordml" xmlns:wps="http://schemas.microsoft.com/office/word/2010/wordprocessingShape" mc:Ignorable="w14 w15 w16se w16cid w16 w16cex w16sdtdh w16sdtfl w16du wp14">
   <w:body>
     <w:p>
-      <w:r>
-        <w:t>We will do some more transformations and then move on to dashboard development</w:t>
-      </w:r>
-    </w:p>
-    <w:p>
-      <w:r>
-        <w:t>Transformations:</w:t>
-      </w:r>
-    </w:p>
-    <w:p>
-      <w:pPr>
-        <w:pStyle w:val="ListParagraph"/>
+      <w:pPr>
+        <w:rPr>
+          <w:b/>
+          <w:bCs/>
+        </w:rPr>
+      </w:pPr>
+      <w:r>
+        <w:rPr>
+          <w:rFonts w:ascii="Segoe UI Emoji" w:hAnsi="Segoe UI Emoji" w:cs="Segoe UI Emoji"/>
+          <w:b/>
+          <w:bCs/>
+        </w:rPr>
+        <w:t>📊</w:t>
+      </w:r>
+      <w:r>
+        <w:rPr>
+          <w:b/>
+          <w:bCs/>
+        </w:rPr>
+        <w:t xml:space="preserve"> Power BI Report Development Guide</w:t>
+      </w:r>
+    </w:p>
+    <w:p>
+      <w:r>
+        <w:t>This document outlines the key data transformations and dashboard-building steps for our Power BI project.</w:t>
+      </w:r>
+    </w:p>
+    <w:p>
+      <w:r>
+        <w:pict w14:anchorId="09E0ACEA">
+          <v:rect id="_x0000_i1056" style="width:0;height:1.5pt" o:hralign="center" o:hrstd="t" o:hr="t" fillcolor="#a0a0a0" stroked="f"/>
+        </w:pict>
+      </w:r>
+    </w:p>
+    <w:p>
+      <w:pPr>
+        <w:rPr>
+          <w:b/>
+          <w:bCs/>
+        </w:rPr>
+      </w:pPr>
+      <w:r>
+        <w:rPr>
+          <w:rFonts w:ascii="Segoe UI Emoji" w:hAnsi="Segoe UI Emoji" w:cs="Segoe UI Emoji"/>
+          <w:b/>
+          <w:bCs/>
+        </w:rPr>
+        <w:t>🔄</w:t>
+      </w:r>
+      <w:r>
+        <w:rPr>
+          <w:b/>
+          <w:bCs/>
+        </w:rPr>
+        <w:t xml:space="preserve"> Data Transformations</w:t>
+      </w:r>
+    </w:p>
+    <w:p>
+      <w:r>
+        <w:t>To ensure clean and relevant data for analysis, we will apply the following filters:</w:t>
+      </w:r>
+    </w:p>
+    <w:p>
+      <w:pPr>
         <w:numPr>
           <w:ilvl w:val="0"/>
-          <w:numId w:val="1"/>
+          <w:numId w:val="3"/>
         </w:numPr>
       </w:pPr>
       <w:r>
-        <w:t>We will remove duplicates where currency = ’USD’</w:t>
-      </w:r>
-      <w:r>
-        <w:t xml:space="preserve"> and </w:t>
-      </w:r>
-      <w:r>
-        <w:t>‘INR’</w:t>
-      </w:r>
-      <w:r>
-        <w:t xml:space="preserve"> – we will do this by filtering only </w:t>
-      </w:r>
-      <w:r>
-        <w:t>"INR#(</w:t>
+        <w:rPr>
+          <w:b/>
+          <w:bCs/>
+        </w:rPr>
+        <w:t>Currency Filtering:</w:t>
+      </w:r>
+    </w:p>
+    <w:p>
+      <w:pPr>
+        <w:numPr>
+          <w:ilvl w:val="1"/>
+          <w:numId w:val="3"/>
+        </w:numPr>
+      </w:pPr>
+      <w:r>
+        <w:t>Retain only rows where currency is "INR#(</w:t>
       </w:r>
       <w:proofErr w:type="spellStart"/>
       <w:r>
@@ -41,13 +96,7 @@
       </w:r>
       <w:proofErr w:type="spellEnd"/>
       <w:r>
-        <w:t>)"</w:t>
-      </w:r>
-      <w:r>
-        <w:t xml:space="preserve"> and </w:t>
-      </w:r>
-      <w:r>
-        <w:t>"USD#(</w:t>
+        <w:t>)" or "USD#(</w:t>
       </w:r>
       <w:proofErr w:type="spellStart"/>
       <w:r>
@@ -55,261 +104,481 @@
       </w:r>
       <w:proofErr w:type="spellEnd"/>
       <w:r>
-        <w:t>)"</w:t>
-      </w:r>
-      <w:r>
-        <w:t xml:space="preserve"> currency values</w:t>
-      </w:r>
-    </w:p>
-    <w:p>
-      <w:pPr>
-        <w:pStyle w:val="ListParagraph"/>
+        <w:t>)".</w:t>
+      </w:r>
+    </w:p>
+    <w:p>
+      <w:pPr>
+        <w:numPr>
+          <w:ilvl w:val="1"/>
+          <w:numId w:val="3"/>
+        </w:numPr>
+      </w:pPr>
+      <w:r>
+        <w:t>This removes duplicates and ensures consistency in currency representation.</w:t>
+      </w:r>
+    </w:p>
+    <w:p>
+      <w:pPr>
         <w:numPr>
           <w:ilvl w:val="0"/>
-          <w:numId w:val="1"/>
+          <w:numId w:val="3"/>
         </w:numPr>
       </w:pPr>
       <w:r>
-        <w:t>Remove duplicates where currency = ‘INR’</w:t>
-      </w:r>
-    </w:p>
-    <w:p/>
-    <w:p>
-      <w:r>
-        <w:t>Report Building:</w:t>
-      </w:r>
-    </w:p>
-    <w:p>
-      <w:pPr>
-        <w:pStyle w:val="ListParagraph"/>
+        <w:rPr>
+          <w:b/>
+          <w:bCs/>
+        </w:rPr>
+        <w:t>Duplicate Removal:</w:t>
+      </w:r>
+    </w:p>
+    <w:p>
+      <w:pPr>
+        <w:numPr>
+          <w:ilvl w:val="1"/>
+          <w:numId w:val="3"/>
+        </w:numPr>
+      </w:pPr>
+      <w:r>
+        <w:t>Specifically remove duplicate entries where currency = 'INR'.</w:t>
+      </w:r>
+    </w:p>
+    <w:p>
+      <w:r>
+        <w:t>These steps help streamline the dataset before visualization.</w:t>
+      </w:r>
+    </w:p>
+    <w:p>
+      <w:r>
+        <w:pict w14:anchorId="0B565073">
+          <v:rect id="_x0000_i1057" style="width:0;height:1.5pt" o:hralign="center" o:hrstd="t" o:hr="t" fillcolor="#a0a0a0" stroked="f"/>
+        </w:pict>
+      </w:r>
+    </w:p>
+    <w:p>
+      <w:pPr>
+        <w:rPr>
+          <w:b/>
+          <w:bCs/>
+        </w:rPr>
+      </w:pPr>
+      <w:r>
+        <w:rPr>
+          <w:rFonts w:ascii="Segoe UI Emoji" w:hAnsi="Segoe UI Emoji" w:cs="Segoe UI Emoji"/>
+          <w:b/>
+          <w:bCs/>
+        </w:rPr>
+        <w:t>📁</w:t>
+      </w:r>
+      <w:r>
+        <w:rPr>
+          <w:b/>
+          <w:bCs/>
+        </w:rPr>
+        <w:t xml:space="preserve"> Report Building Workflow</w:t>
+      </w:r>
+    </w:p>
+    <w:p>
+      <w:pPr>
+        <w:rPr>
+          <w:b/>
+          <w:bCs/>
+        </w:rPr>
+      </w:pPr>
+      <w:r>
+        <w:rPr>
+          <w:b/>
+          <w:bCs/>
+        </w:rPr>
+        <w:t>1. Create Base Measures Table</w:t>
+      </w:r>
+    </w:p>
+    <w:p>
+      <w:pPr>
         <w:numPr>
           <w:ilvl w:val="0"/>
-          <w:numId w:val="2"/>
+          <w:numId w:val="4"/>
         </w:numPr>
       </w:pPr>
       <w:r>
-        <w:t xml:space="preserve">First thing we will do </w:t>
+        <w:t xml:space="preserve">Go to </w:t>
+      </w:r>
+      <w:r>
+        <w:rPr>
+          <w:b/>
+          <w:bCs/>
+        </w:rPr>
+        <w:t>Home</w:t>
+      </w:r>
+      <w:r>
+        <w:t xml:space="preserve"> → </w:t>
+      </w:r>
+      <w:r>
+        <w:rPr>
+          <w:b/>
+          <w:bCs/>
+        </w:rPr>
+        <w:t>Enter Data</w:t>
+      </w:r>
+      <w:r>
+        <w:t>.</w:t>
+      </w:r>
+    </w:p>
+    <w:p>
+      <w:pPr>
+        <w:numPr>
+          <w:ilvl w:val="0"/>
+          <w:numId w:val="4"/>
+        </w:numPr>
+      </w:pPr>
+      <w:r>
+        <w:t xml:space="preserve">Rename the new table to </w:t>
+      </w:r>
+      <w:proofErr w:type="spellStart"/>
+      <w:r>
+        <w:rPr>
+          <w:b/>
+          <w:bCs/>
+        </w:rPr>
+        <w:t>BaseMeasures</w:t>
+      </w:r>
+      <w:proofErr w:type="spellEnd"/>
+      <w:r>
+        <w:t xml:space="preserve"> and click </w:t>
+      </w:r>
+      <w:r>
+        <w:rPr>
+          <w:b/>
+          <w:bCs/>
+        </w:rPr>
+        <w:t>Load</w:t>
+      </w:r>
+      <w:r>
+        <w:t>.</w:t>
+      </w:r>
+    </w:p>
+    <w:p>
+      <w:pPr>
+        <w:numPr>
+          <w:ilvl w:val="0"/>
+          <w:numId w:val="4"/>
+        </w:numPr>
+      </w:pPr>
+      <w:r>
+        <w:t>This table will serve as the foundation for all KPI measures and UI elements.</w:t>
+      </w:r>
+    </w:p>
+    <w:p>
+      <w:pPr>
+        <w:rPr>
+          <w:b/>
+          <w:bCs/>
+        </w:rPr>
+      </w:pPr>
+      <w:r>
+        <w:rPr>
+          <w:b/>
+          <w:bCs/>
+        </w:rPr>
+        <w:t>2. Define KPI Measures</w:t>
+      </w:r>
+    </w:p>
+    <w:p>
+      <w:r>
+        <w:t xml:space="preserve">In the </w:t>
+      </w:r>
+      <w:proofErr w:type="spellStart"/>
+      <w:r>
+        <w:rPr>
+          <w:b/>
+          <w:bCs/>
+        </w:rPr>
+        <w:t>BaseMeasures</w:t>
+      </w:r>
+      <w:proofErr w:type="spellEnd"/>
+      <w:r>
+        <w:t xml:space="preserve"> table:</w:t>
+      </w:r>
+    </w:p>
+    <w:p>
+      <w:pPr>
+        <w:numPr>
+          <w:ilvl w:val="0"/>
+          <w:numId w:val="5"/>
+        </w:numPr>
+      </w:pPr>
+      <w:r>
+        <w:t xml:space="preserve">Click on the </w:t>
+      </w:r>
+      <w:r>
+        <w:rPr>
+          <w:b/>
+          <w:bCs/>
+        </w:rPr>
+        <w:t>ellipsis (...)</w:t>
+      </w:r>
+      <w:r>
+        <w:t xml:space="preserve"> next to the table name.</w:t>
+      </w:r>
+    </w:p>
+    <w:p>
+      <w:pPr>
+        <w:numPr>
+          <w:ilvl w:val="0"/>
+          <w:numId w:val="5"/>
+        </w:numPr>
+      </w:pPr>
+      <w:r>
+        <w:t xml:space="preserve">Select </w:t>
+      </w:r>
+      <w:r>
+        <w:rPr>
+          <w:b/>
+          <w:bCs/>
+        </w:rPr>
+        <w:t>New Measure</w:t>
+      </w:r>
+      <w:r>
+        <w:t xml:space="preserve"> and define the following:</w:t>
+      </w:r>
+    </w:p>
+    <w:p>
+      <w:r>
+        <w:t xml:space="preserve">Revenue = </w:t>
       </w:r>
       <w:proofErr w:type="gramStart"/>
       <w:r>
-        <w:t>this :</w:t>
+        <w:t>SUM(</w:t>
       </w:r>
       <w:proofErr w:type="gramEnd"/>
       <w:r>
-        <w:t xml:space="preserve"> click on Enter Data - &gt; rename the table as ‘</w:t>
+        <w:t>'sales transactions'[</w:t>
       </w:r>
       <w:proofErr w:type="spellStart"/>
       <w:r>
-        <w:t>BaseMeasures</w:t>
+        <w:t>sales_amount_INR</w:t>
       </w:r>
       <w:proofErr w:type="spellEnd"/>
       <w:r>
-        <w:t>’ -&gt; load</w:t>
-      </w:r>
-    </w:p>
-    <w:p>
-      <w:pPr>
-        <w:pStyle w:val="ListParagraph"/>
-      </w:pPr>
-      <w:r>
-        <w:t>We will create this table which will be used to plot various UI elements on our dashboard</w:t>
-      </w:r>
-    </w:p>
-    <w:p>
-      <w:pPr>
-        <w:pStyle w:val="ListParagraph"/>
-      </w:pPr>
-      <w:r>
-        <w:t xml:space="preserve">Click on … on </w:t>
+        <w:t>])</w:t>
+      </w:r>
+    </w:p>
+    <w:p>
+      <w:r>
+        <w:t xml:space="preserve">Sales Qty = </w:t>
+      </w:r>
+      <w:proofErr w:type="gramStart"/>
+      <w:r>
+        <w:t>SUM(</w:t>
+      </w:r>
+      <w:proofErr w:type="gramEnd"/>
+      <w:r>
+        <w:t>'sales transactions'[</w:t>
       </w:r>
       <w:proofErr w:type="spellStart"/>
       <w:r>
-        <w:t>BaseMeasures</w:t>
+        <w:t>sales_qty</w:t>
       </w:r>
       <w:proofErr w:type="spellEnd"/>
       <w:r>
-        <w:t xml:space="preserve"> -&gt; click on New Measure</w:t>
-      </w:r>
-    </w:p>
-    <w:p>
-      <w:pPr>
-        <w:pStyle w:val="ListParagraph"/>
-      </w:pPr>
-      <w:r>
-        <w:t xml:space="preserve">Mainly using this we will create all the KPI using new measures under the </w:t>
-      </w:r>
-      <w:proofErr w:type="spellStart"/>
-      <w:r>
-        <w:t>BaseMeasures</w:t>
-      </w:r>
-      <w:proofErr w:type="spellEnd"/>
-      <w:r>
-        <w:t xml:space="preserve"> table</w:t>
-      </w:r>
-    </w:p>
-    <w:p>
-      <w:pPr>
-        <w:pStyle w:val="ListParagraph"/>
+        <w:t>])</w:t>
+      </w:r>
+    </w:p>
+    <w:p>
+      <w:r>
+        <w:t>You can continue adding more measures as needed for dashboard KPIs.</w:t>
+      </w:r>
+    </w:p>
+    <w:p>
+      <w:r>
+        <w:pict w14:anchorId="0958F6AD">
+          <v:rect id="_x0000_i1058" style="width:0;height:1.5pt" o:hralign="center" o:hrstd="t" o:hr="t" fillcolor="#a0a0a0" stroked="f"/>
+        </w:pict>
+      </w:r>
+    </w:p>
+    <w:p>
+      <w:pPr>
+        <w:rPr>
+          <w:b/>
+          <w:bCs/>
+        </w:rPr>
+      </w:pPr>
+      <w:r>
+        <w:rPr>
+          <w:rFonts w:ascii="Segoe UI Emoji" w:hAnsi="Segoe UI Emoji" w:cs="Segoe UI Emoji"/>
+          <w:b/>
+          <w:bCs/>
+        </w:rPr>
+        <w:t>📊</w:t>
+      </w:r>
+      <w:r>
+        <w:rPr>
+          <w:b/>
+          <w:bCs/>
+        </w:rPr>
+        <w:t xml:space="preserve"> Dashboard Visuals</w:t>
+      </w:r>
+    </w:p>
+    <w:p>
+      <w:pPr>
+        <w:rPr>
+          <w:b/>
+          <w:bCs/>
+        </w:rPr>
+      </w:pPr>
+      <w:r>
+        <w:rPr>
+          <w:rFonts w:ascii="Segoe UI Emoji" w:hAnsi="Segoe UI Emoji" w:cs="Segoe UI Emoji"/>
+          <w:b/>
+          <w:bCs/>
+        </w:rPr>
+        <w:t>✅</w:t>
+      </w:r>
+      <w:r>
+        <w:rPr>
+          <w:b/>
+          <w:bCs/>
+        </w:rPr>
+        <w:t xml:space="preserve"> Visual Elements to Create:</w:t>
+      </w:r>
+    </w:p>
+    <w:p>
+      <w:pPr>
+        <w:numPr>
+          <w:ilvl w:val="0"/>
+          <w:numId w:val="6"/>
+        </w:numPr>
+      </w:pPr>
+      <w:r>
+        <w:rPr>
+          <w:b/>
+          <w:bCs/>
+        </w:rPr>
+        <w:t>Horizontal Bar Charts:</w:t>
+      </w:r>
+    </w:p>
+    <w:p>
+      <w:pPr>
         <w:numPr>
           <w:ilvl w:val="1"/>
-          <w:numId w:val="2"/>
+          <w:numId w:val="6"/>
         </w:numPr>
       </w:pPr>
-      <w:r>
-        <w:t>1</w:t>
-      </w:r>
-      <w:r>
-        <w:rPr>
-          <w:vertAlign w:val="superscript"/>
-        </w:rPr>
-        <w:t>st</w:t>
-      </w:r>
-      <w:r>
-        <w:t xml:space="preserve"> measure is ‘Revenue</w:t>
-      </w:r>
-      <w:proofErr w:type="gramStart"/>
-      <w:r>
-        <w:t>’ :</w:t>
-      </w:r>
-      <w:proofErr w:type="gramEnd"/>
-      <w:r>
-        <w:t xml:space="preserve"> </w:t>
-      </w:r>
-      <w:r>
-        <w:t xml:space="preserve">Revenue = </w:t>
-      </w:r>
-      <w:proofErr w:type="gramStart"/>
-      <w:r>
-        <w:t>SUM(</w:t>
-      </w:r>
-      <w:proofErr w:type="gramEnd"/>
-      <w:r>
-        <w:t>'sales transactions'[</w:t>
-      </w:r>
       <w:proofErr w:type="spellStart"/>
       <w:r>
-        <w:t>sales_amount_INR</w:t>
+        <w:t>Customer_name</w:t>
       </w:r>
       <w:proofErr w:type="spellEnd"/>
       <w:r>
-        <w:t>])</w:t>
-      </w:r>
-    </w:p>
-    <w:p>
-      <w:pPr>
-        <w:pStyle w:val="ListParagraph"/>
+        <w:t xml:space="preserve"> vs Revenue</w:t>
+      </w:r>
+    </w:p>
+    <w:p>
+      <w:pPr>
         <w:numPr>
           <w:ilvl w:val="1"/>
-          <w:numId w:val="2"/>
+          <w:numId w:val="6"/>
         </w:numPr>
       </w:pPr>
-      <w:r>
-        <w:t>2</w:t>
-      </w:r>
-      <w:r>
-        <w:rPr>
-          <w:vertAlign w:val="superscript"/>
-        </w:rPr>
-        <w:t>nd</w:t>
-      </w:r>
-      <w:r>
-        <w:t xml:space="preserve"> measure is ‘Sales Qty</w:t>
-      </w:r>
-      <w:proofErr w:type="gramStart"/>
-      <w:r>
-        <w:t>’ :</w:t>
-      </w:r>
-      <w:proofErr w:type="gramEnd"/>
-      <w:r>
-        <w:t xml:space="preserve"> </w:t>
-      </w:r>
-      <w:r>
-        <w:t xml:space="preserve">Sales Qty = </w:t>
-      </w:r>
-      <w:proofErr w:type="gramStart"/>
-      <w:r>
-        <w:t>SUM(</w:t>
-      </w:r>
-      <w:proofErr w:type="gramEnd"/>
-      <w:r>
-        <w:t>'sales transactions'[</w:t>
-      </w:r>
       <w:proofErr w:type="spellStart"/>
       <w:r>
-        <w:t>sales_qty</w:t>
+        <w:t>Customer_name</w:t>
       </w:r>
       <w:proofErr w:type="spellEnd"/>
       <w:r>
-        <w:t>])</w:t>
-      </w:r>
-    </w:p>
-    <w:p>
-      <w:pPr>
-        <w:pStyle w:val="ListParagraph"/>
+        <w:t xml:space="preserve"> vs Sales Qty</w:t>
+      </w:r>
+    </w:p>
+    <w:p>
+      <w:pPr>
+        <w:numPr>
+          <w:ilvl w:val="0"/>
+          <w:numId w:val="6"/>
+        </w:numPr>
+      </w:pPr>
+      <w:r>
+        <w:rPr>
+          <w:b/>
+          <w:bCs/>
+        </w:rPr>
+        <w:lastRenderedPageBreak/>
+        <w:t>Slicers:</w:t>
+      </w:r>
+    </w:p>
+    <w:p>
+      <w:pPr>
         <w:numPr>
           <w:ilvl w:val="1"/>
-          <w:numId w:val="2"/>
+          <w:numId w:val="6"/>
         </w:numPr>
       </w:pPr>
       <w:r>
-        <w:t>3</w:t>
-      </w:r>
-      <w:r>
-        <w:rPr>
-          <w:vertAlign w:val="superscript"/>
-        </w:rPr>
-        <w:t>rd</w:t>
-      </w:r>
-      <w:r>
-        <w:t xml:space="preserve"> measure is</w:t>
-      </w:r>
-    </w:p>
-    <w:p>
-      <w:pPr>
-        <w:pStyle w:val="ListParagraph"/>
+        <w:t xml:space="preserve">Year slicer using the year column from the </w:t>
+      </w:r>
+      <w:r>
+        <w:rPr>
+          <w:b/>
+          <w:bCs/>
+        </w:rPr>
+        <w:t>Date</w:t>
+      </w:r>
+      <w:r>
+        <w:t xml:space="preserve"> table.</w:t>
+      </w:r>
+    </w:p>
+    <w:p>
+      <w:pPr>
+        <w:numPr>
+          <w:ilvl w:val="1"/>
+          <w:numId w:val="6"/>
+        </w:numPr>
+      </w:pPr>
+      <w:r>
+        <w:t>Quarter slicer using the quarter column.</w:t>
+      </w:r>
+    </w:p>
+    <w:p>
+      <w:pPr>
         <w:numPr>
           <w:ilvl w:val="0"/>
-          <w:numId w:val="2"/>
+          <w:numId w:val="6"/>
         </w:numPr>
       </w:pPr>
       <w:r>
-        <w:t xml:space="preserve">We will create two horizontal bar charts one showing </w:t>
-      </w:r>
-      <w:proofErr w:type="spellStart"/>
-      <w:r>
-        <w:t>Customer_name</w:t>
-      </w:r>
-      <w:proofErr w:type="spellEnd"/>
-      <w:r>
-        <w:t xml:space="preserve"> VS Revenue generated and other will show </w:t>
-      </w:r>
-      <w:proofErr w:type="spellStart"/>
-      <w:r>
-        <w:t>Customer_name</w:t>
-      </w:r>
-      <w:proofErr w:type="spellEnd"/>
-      <w:r>
-        <w:t xml:space="preserve"> VS</w:t>
-      </w:r>
-      <w:r>
-        <w:t xml:space="preserve"> Sales Qty.</w:t>
-      </w:r>
-    </w:p>
-    <w:p>
-      <w:pPr>
-        <w:pStyle w:val="ListParagraph"/>
+        <w:rPr>
+          <w:b/>
+          <w:bCs/>
+        </w:rPr>
+        <w:t>Trend Chart:</w:t>
+      </w:r>
+    </w:p>
+    <w:p>
+      <w:pPr>
         <w:numPr>
-          <w:ilvl w:val="0"/>
-          <w:numId w:val="2"/>
+          <w:ilvl w:val="1"/>
+          <w:numId w:val="6"/>
         </w:numPr>
       </w:pPr>
-      <w:proofErr w:type="gramStart"/>
-      <w:r>
-        <w:t>Next</w:t>
-      </w:r>
-      <w:proofErr w:type="gramEnd"/>
-      <w:r>
-        <w:t xml:space="preserve"> we will create a slicer by using the year column of the date table</w:t>
+      <w:r>
+        <w:t xml:space="preserve">A line or area chart showing </w:t>
+      </w:r>
+      <w:r>
+        <w:rPr>
+          <w:b/>
+          <w:bCs/>
+        </w:rPr>
+        <w:t>Revenue over time</w:t>
+      </w:r>
+      <w:r>
+        <w:t>.</w:t>
+      </w:r>
+    </w:p>
+    <w:p>
+      <w:r>
+        <w:pict w14:anchorId="34FC1118">
+          <v:rect id="_x0000_i1059" style="width:0;height:1.5pt" o:hralign="center" o:hrstd="t" o:hr="t" fillcolor="#a0a0a0" stroked="f"/>
+        </w:pict>
       </w:r>
     </w:p>
     <w:sectPr>
@@ -325,6 +594,453 @@
 <file path=word/numbering.xml><?xml version="1.0" encoding="utf-8"?>
 <w:numbering xmlns:wpc="http://schemas.microsoft.com/office/word/2010/wordprocessingCanvas" xmlns:cx="http://schemas.microsoft.com/office/drawing/2014/chartex" xmlns:cx1="http://schemas.microsoft.com/office/drawing/2015/9/8/chartex" xmlns:cx2="http://schemas.microsoft.com/office/drawing/2015/10/21/chartex" xmlns:cx3="http://schemas.microsoft.com/office/drawing/2016/5/9/chartex" xmlns:cx4="http://schemas.microsoft.com/office/drawing/2016/5/10/chartex" xmlns:cx5="http://schemas.microsoft.com/office/drawing/2016/5/11/chartex" xmlns:cx6="http://schemas.microsoft.com/office/drawing/2016/5/12/chartex" xmlns:cx7="http://schemas.microsoft.com/office/drawing/2016/5/13/chartex" xmlns:cx8="http://schemas.microsoft.com/office/drawing/2016/5/14/chartex" xmlns:mc="http://schemas.openxmlformats.org/markup-compatibility/2006" xmlns:aink="http://schemas.microsoft.com/office/drawing/2016/ink" xmlns:am3d="http://schemas.microsoft.com/office/drawing/2017/model3d" xmlns:o="urn:schemas-microsoft-com:office:office" xmlns:oel="http://schemas.microsoft.com/office/2019/extlst" xmlns:r="http://schemas.openxmlformats.org/officeDocument/2006/relationships" xmlns:m="http://schemas.openxmlformats.org/officeDocument/2006/math" xmlns:v="urn:schemas-microsoft-com:vml" xmlns:wp14="http://schemas.microsoft.com/office/word/2010/wordprocessingDrawing" xmlns:wp="http://schemas.openxmlformats.org/drawingml/2006/wordprocessingDrawing" xmlns:w10="urn:schemas-microsoft-com:office:word" xmlns:w="http://schemas.openxmlformats.org/wordprocessingml/2006/main" xmlns:w14="http://schemas.microsoft.com/office/word/2010/wordml" xmlns:w15="http://schemas.microsoft.com/office/word/2012/wordml" xmlns:w16cex="http://schemas.microsoft.com/office/word/2018/wordml/cex" xmlns:w16cid="http://schemas.microsoft.com/office/word/2016/wordml/cid" xmlns:w16="http://schemas.microsoft.com/office/word/2018/wordml" xmlns:w16du="http://schemas.microsoft.com/office/word/2023/wordml/word16du" xmlns:w16sdtdh="http://schemas.microsoft.com/office/word/2020/wordml/sdtdatahash" xmlns:w16sdtfl="http://schemas.microsoft.com/office/word/2024/wordml/sdtformatlock" xmlns:w16se="http://schemas.microsoft.com/office/word/2015/wordml/symex" xmlns:wpg="http://schemas.microsoft.com/office/word/2010/wordprocessingGroup" xmlns:wpi="http://schemas.microsoft.com/office/word/2010/wordprocessingInk" xmlns:wne="http://schemas.microsoft.com/office/word/2006/wordml" xmlns:wps="http://schemas.microsoft.com/office/word/2010/wordprocessingShape" mc:Ignorable="w14 w15 w16se w16cid w16 w16cex w16sdtdh w16sdtfl w16du wp14">
   <w:abstractNum w:abstractNumId="0" w15:restartNumberingAfterBreak="0">
+    <w:nsid w:val="00E74DBB"/>
+    <w:multiLevelType w:val="multilevel"/>
+    <w:tmpl w:val="852A0204"/>
+    <w:lvl w:ilvl="0">
+      <w:start w:val="1"/>
+      <w:numFmt w:val="bullet"/>
+      <w:lvlText w:val=""/>
+      <w:lvlJc w:val="left"/>
+      <w:pPr>
+        <w:tabs>
+          <w:tab w:val="num" w:pos="720"/>
+        </w:tabs>
+        <w:ind w:left="720" w:hanging="360"/>
+      </w:pPr>
+      <w:rPr>
+        <w:rFonts w:ascii="Symbol" w:hAnsi="Symbol" w:hint="default"/>
+        <w:sz w:val="20"/>
+      </w:rPr>
+    </w:lvl>
+    <w:lvl w:ilvl="1" w:tentative="1">
+      <w:start w:val="1"/>
+      <w:numFmt w:val="bullet"/>
+      <w:lvlText w:val="o"/>
+      <w:lvlJc w:val="left"/>
+      <w:pPr>
+        <w:tabs>
+          <w:tab w:val="num" w:pos="1440"/>
+        </w:tabs>
+        <w:ind w:left="1440" w:hanging="360"/>
+      </w:pPr>
+      <w:rPr>
+        <w:rFonts w:ascii="Courier New" w:hAnsi="Courier New" w:hint="default"/>
+        <w:sz w:val="20"/>
+      </w:rPr>
+    </w:lvl>
+    <w:lvl w:ilvl="2" w:tentative="1">
+      <w:start w:val="1"/>
+      <w:numFmt w:val="bullet"/>
+      <w:lvlText w:val=""/>
+      <w:lvlJc w:val="left"/>
+      <w:pPr>
+        <w:tabs>
+          <w:tab w:val="num" w:pos="2160"/>
+        </w:tabs>
+        <w:ind w:left="2160" w:hanging="360"/>
+      </w:pPr>
+      <w:rPr>
+        <w:rFonts w:ascii="Wingdings" w:hAnsi="Wingdings" w:hint="default"/>
+        <w:sz w:val="20"/>
+      </w:rPr>
+    </w:lvl>
+    <w:lvl w:ilvl="3" w:tentative="1">
+      <w:start w:val="1"/>
+      <w:numFmt w:val="bullet"/>
+      <w:lvlText w:val=""/>
+      <w:lvlJc w:val="left"/>
+      <w:pPr>
+        <w:tabs>
+          <w:tab w:val="num" w:pos="2880"/>
+        </w:tabs>
+        <w:ind w:left="2880" w:hanging="360"/>
+      </w:pPr>
+      <w:rPr>
+        <w:rFonts w:ascii="Wingdings" w:hAnsi="Wingdings" w:hint="default"/>
+        <w:sz w:val="20"/>
+      </w:rPr>
+    </w:lvl>
+    <w:lvl w:ilvl="4" w:tentative="1">
+      <w:start w:val="1"/>
+      <w:numFmt w:val="bullet"/>
+      <w:lvlText w:val=""/>
+      <w:lvlJc w:val="left"/>
+      <w:pPr>
+        <w:tabs>
+          <w:tab w:val="num" w:pos="3600"/>
+        </w:tabs>
+        <w:ind w:left="3600" w:hanging="360"/>
+      </w:pPr>
+      <w:rPr>
+        <w:rFonts w:ascii="Wingdings" w:hAnsi="Wingdings" w:hint="default"/>
+        <w:sz w:val="20"/>
+      </w:rPr>
+    </w:lvl>
+    <w:lvl w:ilvl="5" w:tentative="1">
+      <w:start w:val="1"/>
+      <w:numFmt w:val="bullet"/>
+      <w:lvlText w:val=""/>
+      <w:lvlJc w:val="left"/>
+      <w:pPr>
+        <w:tabs>
+          <w:tab w:val="num" w:pos="4320"/>
+        </w:tabs>
+        <w:ind w:left="4320" w:hanging="360"/>
+      </w:pPr>
+      <w:rPr>
+        <w:rFonts w:ascii="Wingdings" w:hAnsi="Wingdings" w:hint="default"/>
+        <w:sz w:val="20"/>
+      </w:rPr>
+    </w:lvl>
+    <w:lvl w:ilvl="6" w:tentative="1">
+      <w:start w:val="1"/>
+      <w:numFmt w:val="bullet"/>
+      <w:lvlText w:val=""/>
+      <w:lvlJc w:val="left"/>
+      <w:pPr>
+        <w:tabs>
+          <w:tab w:val="num" w:pos="5040"/>
+        </w:tabs>
+        <w:ind w:left="5040" w:hanging="360"/>
+      </w:pPr>
+      <w:rPr>
+        <w:rFonts w:ascii="Wingdings" w:hAnsi="Wingdings" w:hint="default"/>
+        <w:sz w:val="20"/>
+      </w:rPr>
+    </w:lvl>
+    <w:lvl w:ilvl="7" w:tentative="1">
+      <w:start w:val="1"/>
+      <w:numFmt w:val="bullet"/>
+      <w:lvlText w:val=""/>
+      <w:lvlJc w:val="left"/>
+      <w:pPr>
+        <w:tabs>
+          <w:tab w:val="num" w:pos="5760"/>
+        </w:tabs>
+        <w:ind w:left="5760" w:hanging="360"/>
+      </w:pPr>
+      <w:rPr>
+        <w:rFonts w:ascii="Wingdings" w:hAnsi="Wingdings" w:hint="default"/>
+        <w:sz w:val="20"/>
+      </w:rPr>
+    </w:lvl>
+    <w:lvl w:ilvl="8" w:tentative="1">
+      <w:start w:val="1"/>
+      <w:numFmt w:val="bullet"/>
+      <w:lvlText w:val=""/>
+      <w:lvlJc w:val="left"/>
+      <w:pPr>
+        <w:tabs>
+          <w:tab w:val="num" w:pos="6480"/>
+        </w:tabs>
+        <w:ind w:left="6480" w:hanging="360"/>
+      </w:pPr>
+      <w:rPr>
+        <w:rFonts w:ascii="Wingdings" w:hAnsi="Wingdings" w:hint="default"/>
+        <w:sz w:val="20"/>
+      </w:rPr>
+    </w:lvl>
+  </w:abstractNum>
+  <w:abstractNum w:abstractNumId="1" w15:restartNumberingAfterBreak="0">
+    <w:nsid w:val="0E9B0D8D"/>
+    <w:multiLevelType w:val="multilevel"/>
+    <w:tmpl w:val="0212EB42"/>
+    <w:lvl w:ilvl="0">
+      <w:start w:val="1"/>
+      <w:numFmt w:val="bullet"/>
+      <w:lvlText w:val=""/>
+      <w:lvlJc w:val="left"/>
+      <w:pPr>
+        <w:tabs>
+          <w:tab w:val="num" w:pos="720"/>
+        </w:tabs>
+        <w:ind w:left="720" w:hanging="360"/>
+      </w:pPr>
+      <w:rPr>
+        <w:rFonts w:ascii="Symbol" w:hAnsi="Symbol" w:hint="default"/>
+        <w:sz w:val="20"/>
+      </w:rPr>
+    </w:lvl>
+    <w:lvl w:ilvl="1" w:tentative="1">
+      <w:start w:val="1"/>
+      <w:numFmt w:val="bullet"/>
+      <w:lvlText w:val="o"/>
+      <w:lvlJc w:val="left"/>
+      <w:pPr>
+        <w:tabs>
+          <w:tab w:val="num" w:pos="1440"/>
+        </w:tabs>
+        <w:ind w:left="1440" w:hanging="360"/>
+      </w:pPr>
+      <w:rPr>
+        <w:rFonts w:ascii="Courier New" w:hAnsi="Courier New" w:hint="default"/>
+        <w:sz w:val="20"/>
+      </w:rPr>
+    </w:lvl>
+    <w:lvl w:ilvl="2" w:tentative="1">
+      <w:start w:val="1"/>
+      <w:numFmt w:val="bullet"/>
+      <w:lvlText w:val=""/>
+      <w:lvlJc w:val="left"/>
+      <w:pPr>
+        <w:tabs>
+          <w:tab w:val="num" w:pos="2160"/>
+        </w:tabs>
+        <w:ind w:left="2160" w:hanging="360"/>
+      </w:pPr>
+      <w:rPr>
+        <w:rFonts w:ascii="Wingdings" w:hAnsi="Wingdings" w:hint="default"/>
+        <w:sz w:val="20"/>
+      </w:rPr>
+    </w:lvl>
+    <w:lvl w:ilvl="3" w:tentative="1">
+      <w:start w:val="1"/>
+      <w:numFmt w:val="bullet"/>
+      <w:lvlText w:val=""/>
+      <w:lvlJc w:val="left"/>
+      <w:pPr>
+        <w:tabs>
+          <w:tab w:val="num" w:pos="2880"/>
+        </w:tabs>
+        <w:ind w:left="2880" w:hanging="360"/>
+      </w:pPr>
+      <w:rPr>
+        <w:rFonts w:ascii="Wingdings" w:hAnsi="Wingdings" w:hint="default"/>
+        <w:sz w:val="20"/>
+      </w:rPr>
+    </w:lvl>
+    <w:lvl w:ilvl="4" w:tentative="1">
+      <w:start w:val="1"/>
+      <w:numFmt w:val="bullet"/>
+      <w:lvlText w:val=""/>
+      <w:lvlJc w:val="left"/>
+      <w:pPr>
+        <w:tabs>
+          <w:tab w:val="num" w:pos="3600"/>
+        </w:tabs>
+        <w:ind w:left="3600" w:hanging="360"/>
+      </w:pPr>
+      <w:rPr>
+        <w:rFonts w:ascii="Wingdings" w:hAnsi="Wingdings" w:hint="default"/>
+        <w:sz w:val="20"/>
+      </w:rPr>
+    </w:lvl>
+    <w:lvl w:ilvl="5" w:tentative="1">
+      <w:start w:val="1"/>
+      <w:numFmt w:val="bullet"/>
+      <w:lvlText w:val=""/>
+      <w:lvlJc w:val="left"/>
+      <w:pPr>
+        <w:tabs>
+          <w:tab w:val="num" w:pos="4320"/>
+        </w:tabs>
+        <w:ind w:left="4320" w:hanging="360"/>
+      </w:pPr>
+      <w:rPr>
+        <w:rFonts w:ascii="Wingdings" w:hAnsi="Wingdings" w:hint="default"/>
+        <w:sz w:val="20"/>
+      </w:rPr>
+    </w:lvl>
+    <w:lvl w:ilvl="6" w:tentative="1">
+      <w:start w:val="1"/>
+      <w:numFmt w:val="bullet"/>
+      <w:lvlText w:val=""/>
+      <w:lvlJc w:val="left"/>
+      <w:pPr>
+        <w:tabs>
+          <w:tab w:val="num" w:pos="5040"/>
+        </w:tabs>
+        <w:ind w:left="5040" w:hanging="360"/>
+      </w:pPr>
+      <w:rPr>
+        <w:rFonts w:ascii="Wingdings" w:hAnsi="Wingdings" w:hint="default"/>
+        <w:sz w:val="20"/>
+      </w:rPr>
+    </w:lvl>
+    <w:lvl w:ilvl="7" w:tentative="1">
+      <w:start w:val="1"/>
+      <w:numFmt w:val="bullet"/>
+      <w:lvlText w:val=""/>
+      <w:lvlJc w:val="left"/>
+      <w:pPr>
+        <w:tabs>
+          <w:tab w:val="num" w:pos="5760"/>
+        </w:tabs>
+        <w:ind w:left="5760" w:hanging="360"/>
+      </w:pPr>
+      <w:rPr>
+        <w:rFonts w:ascii="Wingdings" w:hAnsi="Wingdings" w:hint="default"/>
+        <w:sz w:val="20"/>
+      </w:rPr>
+    </w:lvl>
+    <w:lvl w:ilvl="8" w:tentative="1">
+      <w:start w:val="1"/>
+      <w:numFmt w:val="bullet"/>
+      <w:lvlText w:val=""/>
+      <w:lvlJc w:val="left"/>
+      <w:pPr>
+        <w:tabs>
+          <w:tab w:val="num" w:pos="6480"/>
+        </w:tabs>
+        <w:ind w:left="6480" w:hanging="360"/>
+      </w:pPr>
+      <w:rPr>
+        <w:rFonts w:ascii="Wingdings" w:hAnsi="Wingdings" w:hint="default"/>
+        <w:sz w:val="20"/>
+      </w:rPr>
+    </w:lvl>
+  </w:abstractNum>
+  <w:abstractNum w:abstractNumId="2" w15:restartNumberingAfterBreak="0">
+    <w:nsid w:val="201B6F56"/>
+    <w:multiLevelType w:val="multilevel"/>
+    <w:tmpl w:val="1D04730A"/>
+    <w:lvl w:ilvl="0">
+      <w:start w:val="1"/>
+      <w:numFmt w:val="bullet"/>
+      <w:lvlText w:val=""/>
+      <w:lvlJc w:val="left"/>
+      <w:pPr>
+        <w:tabs>
+          <w:tab w:val="num" w:pos="720"/>
+        </w:tabs>
+        <w:ind w:left="720" w:hanging="360"/>
+      </w:pPr>
+      <w:rPr>
+        <w:rFonts w:ascii="Symbol" w:hAnsi="Symbol" w:hint="default"/>
+        <w:sz w:val="20"/>
+      </w:rPr>
+    </w:lvl>
+    <w:lvl w:ilvl="1">
+      <w:start w:val="1"/>
+      <w:numFmt w:val="bullet"/>
+      <w:lvlText w:val="o"/>
+      <w:lvlJc w:val="left"/>
+      <w:pPr>
+        <w:tabs>
+          <w:tab w:val="num" w:pos="1440"/>
+        </w:tabs>
+        <w:ind w:left="1440" w:hanging="360"/>
+      </w:pPr>
+      <w:rPr>
+        <w:rFonts w:ascii="Courier New" w:hAnsi="Courier New" w:hint="default"/>
+        <w:sz w:val="20"/>
+      </w:rPr>
+    </w:lvl>
+    <w:lvl w:ilvl="2" w:tentative="1">
+      <w:start w:val="1"/>
+      <w:numFmt w:val="bullet"/>
+      <w:lvlText w:val=""/>
+      <w:lvlJc w:val="left"/>
+      <w:pPr>
+        <w:tabs>
+          <w:tab w:val="num" w:pos="2160"/>
+        </w:tabs>
+        <w:ind w:left="2160" w:hanging="360"/>
+      </w:pPr>
+      <w:rPr>
+        <w:rFonts w:ascii="Wingdings" w:hAnsi="Wingdings" w:hint="default"/>
+        <w:sz w:val="20"/>
+      </w:rPr>
+    </w:lvl>
+    <w:lvl w:ilvl="3" w:tentative="1">
+      <w:start w:val="1"/>
+      <w:numFmt w:val="bullet"/>
+      <w:lvlText w:val=""/>
+      <w:lvlJc w:val="left"/>
+      <w:pPr>
+        <w:tabs>
+          <w:tab w:val="num" w:pos="2880"/>
+        </w:tabs>
+        <w:ind w:left="2880" w:hanging="360"/>
+      </w:pPr>
+      <w:rPr>
+        <w:rFonts w:ascii="Wingdings" w:hAnsi="Wingdings" w:hint="default"/>
+        <w:sz w:val="20"/>
+      </w:rPr>
+    </w:lvl>
+    <w:lvl w:ilvl="4" w:tentative="1">
+      <w:start w:val="1"/>
+      <w:numFmt w:val="bullet"/>
+      <w:lvlText w:val=""/>
+      <w:lvlJc w:val="left"/>
+      <w:pPr>
+        <w:tabs>
+          <w:tab w:val="num" w:pos="3600"/>
+        </w:tabs>
+        <w:ind w:left="3600" w:hanging="360"/>
+      </w:pPr>
+      <w:rPr>
+        <w:rFonts w:ascii="Wingdings" w:hAnsi="Wingdings" w:hint="default"/>
+        <w:sz w:val="20"/>
+      </w:rPr>
+    </w:lvl>
+    <w:lvl w:ilvl="5" w:tentative="1">
+      <w:start w:val="1"/>
+      <w:numFmt w:val="bullet"/>
+      <w:lvlText w:val=""/>
+      <w:lvlJc w:val="left"/>
+      <w:pPr>
+        <w:tabs>
+          <w:tab w:val="num" w:pos="4320"/>
+        </w:tabs>
+        <w:ind w:left="4320" w:hanging="360"/>
+      </w:pPr>
+      <w:rPr>
+        <w:rFonts w:ascii="Wingdings" w:hAnsi="Wingdings" w:hint="default"/>
+        <w:sz w:val="20"/>
+      </w:rPr>
+    </w:lvl>
+    <w:lvl w:ilvl="6" w:tentative="1">
+      <w:start w:val="1"/>
+      <w:numFmt w:val="bullet"/>
+      <w:lvlText w:val=""/>
+      <w:lvlJc w:val="left"/>
+      <w:pPr>
+        <w:tabs>
+          <w:tab w:val="num" w:pos="5040"/>
+        </w:tabs>
+        <w:ind w:left="5040" w:hanging="360"/>
+      </w:pPr>
+      <w:rPr>
+        <w:rFonts w:ascii="Wingdings" w:hAnsi="Wingdings" w:hint="default"/>
+        <w:sz w:val="20"/>
+      </w:rPr>
+    </w:lvl>
+    <w:lvl w:ilvl="7" w:tentative="1">
+      <w:start w:val="1"/>
+      <w:numFmt w:val="bullet"/>
+      <w:lvlText w:val=""/>
+      <w:lvlJc w:val="left"/>
+      <w:pPr>
+        <w:tabs>
+          <w:tab w:val="num" w:pos="5760"/>
+        </w:tabs>
+        <w:ind w:left="5760" w:hanging="360"/>
+      </w:pPr>
+      <w:rPr>
+        <w:rFonts w:ascii="Wingdings" w:hAnsi="Wingdings" w:hint="default"/>
+        <w:sz w:val="20"/>
+      </w:rPr>
+    </w:lvl>
+    <w:lvl w:ilvl="8" w:tentative="1">
+      <w:start w:val="1"/>
+      <w:numFmt w:val="bullet"/>
+      <w:lvlText w:val=""/>
+      <w:lvlJc w:val="left"/>
+      <w:pPr>
+        <w:tabs>
+          <w:tab w:val="num" w:pos="6480"/>
+        </w:tabs>
+        <w:ind w:left="6480" w:hanging="360"/>
+      </w:pPr>
+      <w:rPr>
+        <w:rFonts w:ascii="Wingdings" w:hAnsi="Wingdings" w:hint="default"/>
+        <w:sz w:val="20"/>
+      </w:rPr>
+    </w:lvl>
+  </w:abstractNum>
+  <w:abstractNum w:abstractNumId="3" w15:restartNumberingAfterBreak="0">
     <w:nsid w:val="4B10771A"/>
     <w:multiLevelType w:val="hybridMultilevel"/>
     <w:tmpl w:val="9400413E"/>
@@ -437,7 +1153,7 @@
       </w:rPr>
     </w:lvl>
   </w:abstractNum>
-  <w:abstractNum w:abstractNumId="1" w15:restartNumberingAfterBreak="0">
+  <w:abstractNum w:abstractNumId="4" w15:restartNumberingAfterBreak="0">
     <w:nsid w:val="69430C71"/>
     <w:multiLevelType w:val="hybridMultilevel"/>
     <w:tmpl w:val="F7BEF290"/>
@@ -550,11 +1266,172 @@
       </w:rPr>
     </w:lvl>
   </w:abstractNum>
+  <w:abstractNum w:abstractNumId="5" w15:restartNumberingAfterBreak="0">
+    <w:nsid w:val="6FDC1585"/>
+    <w:multiLevelType w:val="multilevel"/>
+    <w:tmpl w:val="6E38EE66"/>
+    <w:lvl w:ilvl="0">
+      <w:start w:val="1"/>
+      <w:numFmt w:val="bullet"/>
+      <w:lvlText w:val=""/>
+      <w:lvlJc w:val="left"/>
+      <w:pPr>
+        <w:tabs>
+          <w:tab w:val="num" w:pos="720"/>
+        </w:tabs>
+        <w:ind w:left="720" w:hanging="360"/>
+      </w:pPr>
+      <w:rPr>
+        <w:rFonts w:ascii="Symbol" w:hAnsi="Symbol" w:hint="default"/>
+        <w:sz w:val="20"/>
+      </w:rPr>
+    </w:lvl>
+    <w:lvl w:ilvl="1">
+      <w:start w:val="1"/>
+      <w:numFmt w:val="bullet"/>
+      <w:lvlText w:val="o"/>
+      <w:lvlJc w:val="left"/>
+      <w:pPr>
+        <w:tabs>
+          <w:tab w:val="num" w:pos="1440"/>
+        </w:tabs>
+        <w:ind w:left="1440" w:hanging="360"/>
+      </w:pPr>
+      <w:rPr>
+        <w:rFonts w:ascii="Courier New" w:hAnsi="Courier New" w:hint="default"/>
+        <w:sz w:val="20"/>
+      </w:rPr>
+    </w:lvl>
+    <w:lvl w:ilvl="2" w:tentative="1">
+      <w:start w:val="1"/>
+      <w:numFmt w:val="bullet"/>
+      <w:lvlText w:val=""/>
+      <w:lvlJc w:val="left"/>
+      <w:pPr>
+        <w:tabs>
+          <w:tab w:val="num" w:pos="2160"/>
+        </w:tabs>
+        <w:ind w:left="2160" w:hanging="360"/>
+      </w:pPr>
+      <w:rPr>
+        <w:rFonts w:ascii="Wingdings" w:hAnsi="Wingdings" w:hint="default"/>
+        <w:sz w:val="20"/>
+      </w:rPr>
+    </w:lvl>
+    <w:lvl w:ilvl="3" w:tentative="1">
+      <w:start w:val="1"/>
+      <w:numFmt w:val="bullet"/>
+      <w:lvlText w:val=""/>
+      <w:lvlJc w:val="left"/>
+      <w:pPr>
+        <w:tabs>
+          <w:tab w:val="num" w:pos="2880"/>
+        </w:tabs>
+        <w:ind w:left="2880" w:hanging="360"/>
+      </w:pPr>
+      <w:rPr>
+        <w:rFonts w:ascii="Wingdings" w:hAnsi="Wingdings" w:hint="default"/>
+        <w:sz w:val="20"/>
+      </w:rPr>
+    </w:lvl>
+    <w:lvl w:ilvl="4" w:tentative="1">
+      <w:start w:val="1"/>
+      <w:numFmt w:val="bullet"/>
+      <w:lvlText w:val=""/>
+      <w:lvlJc w:val="left"/>
+      <w:pPr>
+        <w:tabs>
+          <w:tab w:val="num" w:pos="3600"/>
+        </w:tabs>
+        <w:ind w:left="3600" w:hanging="360"/>
+      </w:pPr>
+      <w:rPr>
+        <w:rFonts w:ascii="Wingdings" w:hAnsi="Wingdings" w:hint="default"/>
+        <w:sz w:val="20"/>
+      </w:rPr>
+    </w:lvl>
+    <w:lvl w:ilvl="5" w:tentative="1">
+      <w:start w:val="1"/>
+      <w:numFmt w:val="bullet"/>
+      <w:lvlText w:val=""/>
+      <w:lvlJc w:val="left"/>
+      <w:pPr>
+        <w:tabs>
+          <w:tab w:val="num" w:pos="4320"/>
+        </w:tabs>
+        <w:ind w:left="4320" w:hanging="360"/>
+      </w:pPr>
+      <w:rPr>
+        <w:rFonts w:ascii="Wingdings" w:hAnsi="Wingdings" w:hint="default"/>
+        <w:sz w:val="20"/>
+      </w:rPr>
+    </w:lvl>
+    <w:lvl w:ilvl="6" w:tentative="1">
+      <w:start w:val="1"/>
+      <w:numFmt w:val="bullet"/>
+      <w:lvlText w:val=""/>
+      <w:lvlJc w:val="left"/>
+      <w:pPr>
+        <w:tabs>
+          <w:tab w:val="num" w:pos="5040"/>
+        </w:tabs>
+        <w:ind w:left="5040" w:hanging="360"/>
+      </w:pPr>
+      <w:rPr>
+        <w:rFonts w:ascii="Wingdings" w:hAnsi="Wingdings" w:hint="default"/>
+        <w:sz w:val="20"/>
+      </w:rPr>
+    </w:lvl>
+    <w:lvl w:ilvl="7" w:tentative="1">
+      <w:start w:val="1"/>
+      <w:numFmt w:val="bullet"/>
+      <w:lvlText w:val=""/>
+      <w:lvlJc w:val="left"/>
+      <w:pPr>
+        <w:tabs>
+          <w:tab w:val="num" w:pos="5760"/>
+        </w:tabs>
+        <w:ind w:left="5760" w:hanging="360"/>
+      </w:pPr>
+      <w:rPr>
+        <w:rFonts w:ascii="Wingdings" w:hAnsi="Wingdings" w:hint="default"/>
+        <w:sz w:val="20"/>
+      </w:rPr>
+    </w:lvl>
+    <w:lvl w:ilvl="8" w:tentative="1">
+      <w:start w:val="1"/>
+      <w:numFmt w:val="bullet"/>
+      <w:lvlText w:val=""/>
+      <w:lvlJc w:val="left"/>
+      <w:pPr>
+        <w:tabs>
+          <w:tab w:val="num" w:pos="6480"/>
+        </w:tabs>
+        <w:ind w:left="6480" w:hanging="360"/>
+      </w:pPr>
+      <w:rPr>
+        <w:rFonts w:ascii="Wingdings" w:hAnsi="Wingdings" w:hint="default"/>
+        <w:sz w:val="20"/>
+      </w:rPr>
+    </w:lvl>
+  </w:abstractNum>
   <w:num w:numId="1" w16cid:durableId="665550221">
+    <w:abstractNumId w:val="4"/>
+  </w:num>
+  <w:num w:numId="2" w16cid:durableId="1302466949">
+    <w:abstractNumId w:val="3"/>
+  </w:num>
+  <w:num w:numId="3" w16cid:durableId="1573658465">
+    <w:abstractNumId w:val="2"/>
+  </w:num>
+  <w:num w:numId="4" w16cid:durableId="1744336002">
     <w:abstractNumId w:val="1"/>
   </w:num>
-  <w:num w:numId="2" w16cid:durableId="1302466949">
+  <w:num w:numId="5" w16cid:durableId="1437795577">
     <w:abstractNumId w:val="0"/>
+  </w:num>
+  <w:num w:numId="6" w16cid:durableId="1069035485">
+    <w:abstractNumId w:val="5"/>
   </w:num>
 </w:numbering>
 </file>

</xml_diff>